<commit_message>
Generator: restart numbered lists per block; rebuild the Portuguese edition
Co-Authored-By: Claude Fable 5.1 <noreply@anthropic.com>
Claude-Session: https://claude.ai/code/session_01UFcr5H5D9pwq46fdUbm4qE
</commit_message>
<xml_diff>
--- a/renda-extra/produtos/controle-total/pt-BR/ebook.docx
+++ b/renda-extra/produtos/controle-total/pt-BR/ebook.docx
@@ -2254,7 +2254,7 @@
         <w:pStyle w:val="ListParagraph"/>
         <w:numPr>
           <w:ilvl w:val="0"/>
-          <w:numId w:val="3"/>
+          <w:numId w:val="4"/>
         </w:numPr>
         <w:spacing w:after="80" w:line="300"/>
       </w:pPr>
@@ -2271,7 +2271,7 @@
         <w:pStyle w:val="ListParagraph"/>
         <w:numPr>
           <w:ilvl w:val="0"/>
-          <w:numId w:val="3"/>
+          <w:numId w:val="4"/>
         </w:numPr>
         <w:spacing w:after="80" w:line="300"/>
       </w:pPr>
@@ -2288,7 +2288,7 @@
         <w:pStyle w:val="ListParagraph"/>
         <w:numPr>
           <w:ilvl w:val="0"/>
-          <w:numId w:val="3"/>
+          <w:numId w:val="4"/>
         </w:numPr>
         <w:spacing w:after="80" w:line="300"/>
       </w:pPr>
@@ -2857,7 +2857,7 @@
         <w:pStyle w:val="ListParagraph"/>
         <w:numPr>
           <w:ilvl w:val="0"/>
-          <w:numId w:val="3"/>
+          <w:numId w:val="5"/>
         </w:numPr>
         <w:spacing w:after="80" w:line="300"/>
       </w:pPr>
@@ -2883,7 +2883,7 @@
         <w:pStyle w:val="ListParagraph"/>
         <w:numPr>
           <w:ilvl w:val="0"/>
-          <w:numId w:val="3"/>
+          <w:numId w:val="5"/>
         </w:numPr>
         <w:spacing w:after="80" w:line="300"/>
       </w:pPr>
@@ -2909,7 +2909,7 @@
         <w:pStyle w:val="ListParagraph"/>
         <w:numPr>
           <w:ilvl w:val="0"/>
-          <w:numId w:val="3"/>
+          <w:numId w:val="5"/>
         </w:numPr>
         <w:spacing w:after="80" w:line="300"/>
       </w:pPr>
@@ -3104,7 +3104,7 @@
         <w:pStyle w:val="ListParagraph"/>
         <w:numPr>
           <w:ilvl w:val="0"/>
-          <w:numId w:val="3"/>
+          <w:numId w:val="6"/>
         </w:numPr>
         <w:spacing w:after="80" w:line="300"/>
       </w:pPr>
@@ -3121,7 +3121,7 @@
         <w:pStyle w:val="ListParagraph"/>
         <w:numPr>
           <w:ilvl w:val="0"/>
-          <w:numId w:val="3"/>
+          <w:numId w:val="6"/>
         </w:numPr>
         <w:spacing w:after="80" w:line="300"/>
       </w:pPr>
@@ -3138,7 +3138,7 @@
         <w:pStyle w:val="ListParagraph"/>
         <w:numPr>
           <w:ilvl w:val="0"/>
-          <w:numId w:val="3"/>
+          <w:numId w:val="6"/>
         </w:numPr>
         <w:spacing w:after="80" w:line="300"/>
       </w:pPr>
@@ -3155,7 +3155,7 @@
         <w:pStyle w:val="ListParagraph"/>
         <w:numPr>
           <w:ilvl w:val="0"/>
-          <w:numId w:val="3"/>
+          <w:numId w:val="6"/>
         </w:numPr>
         <w:spacing w:after="80" w:line="300"/>
       </w:pPr>
@@ -3574,7 +3574,7 @@
         <w:pStyle w:val="ListParagraph"/>
         <w:numPr>
           <w:ilvl w:val="0"/>
-          <w:numId w:val="3"/>
+          <w:numId w:val="7"/>
         </w:numPr>
         <w:spacing w:after="80" w:line="300"/>
       </w:pPr>
@@ -3600,7 +3600,7 @@
         <w:pStyle w:val="ListParagraph"/>
         <w:numPr>
           <w:ilvl w:val="0"/>
-          <w:numId w:val="3"/>
+          <w:numId w:val="7"/>
         </w:numPr>
         <w:spacing w:after="80" w:line="300"/>
       </w:pPr>
@@ -3626,7 +3626,7 @@
         <w:pStyle w:val="ListParagraph"/>
         <w:numPr>
           <w:ilvl w:val="0"/>
-          <w:numId w:val="3"/>
+          <w:numId w:val="7"/>
         </w:numPr>
         <w:spacing w:after="80" w:line="300"/>
       </w:pPr>
@@ -3652,7 +3652,7 @@
         <w:pStyle w:val="ListParagraph"/>
         <w:numPr>
           <w:ilvl w:val="0"/>
-          <w:numId w:val="3"/>
+          <w:numId w:val="7"/>
         </w:numPr>
         <w:spacing w:after="80" w:line="300"/>
       </w:pPr>
@@ -3678,7 +3678,7 @@
         <w:pStyle w:val="ListParagraph"/>
         <w:numPr>
           <w:ilvl w:val="0"/>
-          <w:numId w:val="3"/>
+          <w:numId w:val="7"/>
         </w:numPr>
         <w:spacing w:after="80" w:line="300"/>
       </w:pPr>
@@ -4143,7 +4143,7 @@
         <w:pStyle w:val="ListParagraph"/>
         <w:numPr>
           <w:ilvl w:val="0"/>
-          <w:numId w:val="3"/>
+          <w:numId w:val="8"/>
         </w:numPr>
         <w:spacing w:after="80" w:line="300"/>
       </w:pPr>
@@ -4160,7 +4160,7 @@
         <w:pStyle w:val="ListParagraph"/>
         <w:numPr>
           <w:ilvl w:val="0"/>
-          <w:numId w:val="3"/>
+          <w:numId w:val="8"/>
         </w:numPr>
         <w:spacing w:after="80" w:line="300"/>
       </w:pPr>
@@ -4177,7 +4177,7 @@
         <w:pStyle w:val="ListParagraph"/>
         <w:numPr>
           <w:ilvl w:val="0"/>
-          <w:numId w:val="3"/>
+          <w:numId w:val="8"/>
         </w:numPr>
         <w:spacing w:after="80" w:line="300"/>
       </w:pPr>
@@ -4194,7 +4194,7 @@
         <w:pStyle w:val="ListParagraph"/>
         <w:numPr>
           <w:ilvl w:val="0"/>
-          <w:numId w:val="3"/>
+          <w:numId w:val="8"/>
         </w:numPr>
         <w:spacing w:after="80" w:line="300"/>
       </w:pPr>
@@ -4211,7 +4211,7 @@
         <w:pStyle w:val="ListParagraph"/>
         <w:numPr>
           <w:ilvl w:val="0"/>
-          <w:numId w:val="3"/>
+          <w:numId w:val="8"/>
         </w:numPr>
         <w:spacing w:after="80" w:line="300"/>
       </w:pPr>
@@ -4489,7 +4489,7 @@
         <w:pStyle w:val="ListParagraph"/>
         <w:numPr>
           <w:ilvl w:val="0"/>
-          <w:numId w:val="3"/>
+          <w:numId w:val="9"/>
         </w:numPr>
         <w:spacing w:after="80" w:line="300"/>
       </w:pPr>
@@ -4506,7 +4506,7 @@
         <w:pStyle w:val="ListParagraph"/>
         <w:numPr>
           <w:ilvl w:val="0"/>
-          <w:numId w:val="3"/>
+          <w:numId w:val="9"/>
         </w:numPr>
         <w:spacing w:after="80" w:line="300"/>
       </w:pPr>
@@ -4523,7 +4523,7 @@
         <w:pStyle w:val="ListParagraph"/>
         <w:numPr>
           <w:ilvl w:val="0"/>
-          <w:numId w:val="3"/>
+          <w:numId w:val="9"/>
         </w:numPr>
         <w:spacing w:after="80" w:line="300"/>
       </w:pPr>
@@ -4540,7 +4540,7 @@
         <w:pStyle w:val="ListParagraph"/>
         <w:numPr>
           <w:ilvl w:val="0"/>
-          <w:numId w:val="3"/>
+          <w:numId w:val="9"/>
         </w:numPr>
         <w:spacing w:after="80" w:line="300"/>
       </w:pPr>
@@ -4557,7 +4557,7 @@
         <w:pStyle w:val="ListParagraph"/>
         <w:numPr>
           <w:ilvl w:val="0"/>
-          <w:numId w:val="3"/>
+          <w:numId w:val="9"/>
         </w:numPr>
         <w:spacing w:after="80" w:line="300"/>
       </w:pPr>
@@ -4852,7 +4852,7 @@
         <w:pStyle w:val="ListParagraph"/>
         <w:numPr>
           <w:ilvl w:val="0"/>
-          <w:numId w:val="3"/>
+          <w:numId w:val="10"/>
         </w:numPr>
         <w:spacing w:after="80" w:line="300"/>
       </w:pPr>
@@ -4869,7 +4869,7 @@
         <w:pStyle w:val="ListParagraph"/>
         <w:numPr>
           <w:ilvl w:val="0"/>
-          <w:numId w:val="3"/>
+          <w:numId w:val="10"/>
         </w:numPr>
         <w:spacing w:after="80" w:line="300"/>
       </w:pPr>
@@ -4886,7 +4886,7 @@
         <w:pStyle w:val="ListParagraph"/>
         <w:numPr>
           <w:ilvl w:val="0"/>
-          <w:numId w:val="3"/>
+          <w:numId w:val="10"/>
         </w:numPr>
         <w:spacing w:after="80" w:line="300"/>
       </w:pPr>
@@ -4903,7 +4903,7 @@
         <w:pStyle w:val="ListParagraph"/>
         <w:numPr>
           <w:ilvl w:val="0"/>
-          <w:numId w:val="3"/>
+          <w:numId w:val="10"/>
         </w:numPr>
         <w:spacing w:after="80" w:line="300"/>
       </w:pPr>
@@ -5828,7 +5828,7 @@
         <w:pStyle w:val="ListParagraph"/>
         <w:numPr>
           <w:ilvl w:val="0"/>
-          <w:numId w:val="3"/>
+          <w:numId w:val="11"/>
         </w:numPr>
         <w:spacing w:after="80" w:line="300"/>
       </w:pPr>
@@ -5845,7 +5845,7 @@
         <w:pStyle w:val="ListParagraph"/>
         <w:numPr>
           <w:ilvl w:val="0"/>
-          <w:numId w:val="3"/>
+          <w:numId w:val="11"/>
         </w:numPr>
         <w:spacing w:after="80" w:line="300"/>
       </w:pPr>
@@ -5862,7 +5862,7 @@
         <w:pStyle w:val="ListParagraph"/>
         <w:numPr>
           <w:ilvl w:val="0"/>
-          <w:numId w:val="3"/>
+          <w:numId w:val="11"/>
         </w:numPr>
         <w:spacing w:after="80" w:line="300"/>
       </w:pPr>
@@ -5879,7 +5879,7 @@
         <w:pStyle w:val="ListParagraph"/>
         <w:numPr>
           <w:ilvl w:val="0"/>
-          <w:numId w:val="3"/>
+          <w:numId w:val="11"/>
         </w:numPr>
         <w:spacing w:after="80" w:line="300"/>
       </w:pPr>
@@ -5896,7 +5896,7 @@
         <w:pStyle w:val="ListParagraph"/>
         <w:numPr>
           <w:ilvl w:val="0"/>
-          <w:numId w:val="3"/>
+          <w:numId w:val="11"/>
         </w:numPr>
         <w:spacing w:after="80" w:line="300"/>
       </w:pPr>
@@ -6186,7 +6186,7 @@
         <w:pStyle w:val="ListParagraph"/>
         <w:numPr>
           <w:ilvl w:val="0"/>
-          <w:numId w:val="3"/>
+          <w:numId w:val="12"/>
         </w:numPr>
         <w:spacing w:after="80" w:line="300"/>
       </w:pPr>
@@ -6203,7 +6203,7 @@
         <w:pStyle w:val="ListParagraph"/>
         <w:numPr>
           <w:ilvl w:val="0"/>
-          <w:numId w:val="3"/>
+          <w:numId w:val="12"/>
         </w:numPr>
         <w:spacing w:after="80" w:line="300"/>
       </w:pPr>
@@ -6220,7 +6220,7 @@
         <w:pStyle w:val="ListParagraph"/>
         <w:numPr>
           <w:ilvl w:val="0"/>
-          <w:numId w:val="3"/>
+          <w:numId w:val="12"/>
         </w:numPr>
         <w:spacing w:after="80" w:line="300"/>
       </w:pPr>
@@ -6237,7 +6237,7 @@
         <w:pStyle w:val="ListParagraph"/>
         <w:numPr>
           <w:ilvl w:val="0"/>
-          <w:numId w:val="3"/>
+          <w:numId w:val="12"/>
         </w:numPr>
         <w:spacing w:after="80" w:line="300"/>
       </w:pPr>
@@ -6254,7 +6254,7 @@
         <w:pStyle w:val="ListParagraph"/>
         <w:numPr>
           <w:ilvl w:val="0"/>
-          <w:numId w:val="3"/>
+          <w:numId w:val="12"/>
         </w:numPr>
         <w:spacing w:after="80" w:line="300"/>
       </w:pPr>
@@ -6469,7 +6469,7 @@
         <w:pStyle w:val="ListParagraph"/>
         <w:numPr>
           <w:ilvl w:val="0"/>
-          <w:numId w:val="3"/>
+          <w:numId w:val="13"/>
         </w:numPr>
         <w:spacing w:after="80" w:line="300"/>
       </w:pPr>
@@ -6486,7 +6486,7 @@
         <w:pStyle w:val="ListParagraph"/>
         <w:numPr>
           <w:ilvl w:val="0"/>
-          <w:numId w:val="3"/>
+          <w:numId w:val="13"/>
         </w:numPr>
         <w:spacing w:after="80" w:line="300"/>
       </w:pPr>
@@ -6503,7 +6503,7 @@
         <w:pStyle w:val="ListParagraph"/>
         <w:numPr>
           <w:ilvl w:val="0"/>
-          <w:numId w:val="3"/>
+          <w:numId w:val="13"/>
         </w:numPr>
         <w:spacing w:after="80" w:line="300"/>
       </w:pPr>
@@ -6520,7 +6520,7 @@
         <w:pStyle w:val="ListParagraph"/>
         <w:numPr>
           <w:ilvl w:val="0"/>
-          <w:numId w:val="3"/>
+          <w:numId w:val="13"/>
         </w:numPr>
         <w:spacing w:after="80" w:line="300"/>
       </w:pPr>
@@ -6537,7 +6537,7 @@
         <w:pStyle w:val="ListParagraph"/>
         <w:numPr>
           <w:ilvl w:val="0"/>
-          <w:numId w:val="3"/>
+          <w:numId w:val="13"/>
         </w:numPr>
         <w:spacing w:after="80" w:line="300"/>
       </w:pPr>
@@ -6554,7 +6554,7 @@
         <w:pStyle w:val="ListParagraph"/>
         <w:numPr>
           <w:ilvl w:val="0"/>
-          <w:numId w:val="3"/>
+          <w:numId w:val="13"/>
         </w:numPr>
         <w:spacing w:after="80" w:line="300"/>
       </w:pPr>
@@ -7262,7 +7262,7 @@
         <w:pStyle w:val="ListParagraph"/>
         <w:numPr>
           <w:ilvl w:val="0"/>
-          <w:numId w:val="3"/>
+          <w:numId w:val="14"/>
         </w:numPr>
         <w:spacing w:after="80" w:line="300"/>
       </w:pPr>
@@ -7279,7 +7279,7 @@
         <w:pStyle w:val="ListParagraph"/>
         <w:numPr>
           <w:ilvl w:val="0"/>
-          <w:numId w:val="3"/>
+          <w:numId w:val="14"/>
         </w:numPr>
         <w:spacing w:after="80" w:line="300"/>
       </w:pPr>
@@ -7296,7 +7296,7 @@
         <w:pStyle w:val="ListParagraph"/>
         <w:numPr>
           <w:ilvl w:val="0"/>
-          <w:numId w:val="3"/>
+          <w:numId w:val="14"/>
         </w:numPr>
         <w:spacing w:after="80" w:line="300"/>
       </w:pPr>
@@ -7313,7 +7313,7 @@
         <w:pStyle w:val="ListParagraph"/>
         <w:numPr>
           <w:ilvl w:val="0"/>
-          <w:numId w:val="3"/>
+          <w:numId w:val="14"/>
         </w:numPr>
         <w:spacing w:after="80" w:line="300"/>
       </w:pPr>
@@ -7330,7 +7330,7 @@
         <w:pStyle w:val="ListParagraph"/>
         <w:numPr>
           <w:ilvl w:val="0"/>
-          <w:numId w:val="3"/>
+          <w:numId w:val="14"/>
         </w:numPr>
         <w:spacing w:after="80" w:line="300"/>
       </w:pPr>
@@ -7625,7 +7625,7 @@
         <w:pStyle w:val="ListParagraph"/>
         <w:numPr>
           <w:ilvl w:val="0"/>
-          <w:numId w:val="3"/>
+          <w:numId w:val="15"/>
         </w:numPr>
         <w:spacing w:after="80" w:line="300"/>
       </w:pPr>
@@ -7642,7 +7642,7 @@
         <w:pStyle w:val="ListParagraph"/>
         <w:numPr>
           <w:ilvl w:val="0"/>
-          <w:numId w:val="3"/>
+          <w:numId w:val="15"/>
         </w:numPr>
         <w:spacing w:after="80" w:line="300"/>
       </w:pPr>
@@ -7659,7 +7659,7 @@
         <w:pStyle w:val="ListParagraph"/>
         <w:numPr>
           <w:ilvl w:val="0"/>
-          <w:numId w:val="3"/>
+          <w:numId w:val="15"/>
         </w:numPr>
         <w:spacing w:after="80" w:line="300"/>
       </w:pPr>
@@ -7676,7 +7676,7 @@
         <w:pStyle w:val="ListParagraph"/>
         <w:numPr>
           <w:ilvl w:val="0"/>
-          <w:numId w:val="3"/>
+          <w:numId w:val="15"/>
         </w:numPr>
         <w:spacing w:after="80" w:line="300"/>
       </w:pPr>
@@ -7693,7 +7693,7 @@
         <w:pStyle w:val="ListParagraph"/>
         <w:numPr>
           <w:ilvl w:val="0"/>
-          <w:numId w:val="3"/>
+          <w:numId w:val="15"/>
         </w:numPr>
         <w:spacing w:after="80" w:line="300"/>
       </w:pPr>
@@ -7971,7 +7971,7 @@
         <w:pStyle w:val="ListParagraph"/>
         <w:numPr>
           <w:ilvl w:val="0"/>
-          <w:numId w:val="3"/>
+          <w:numId w:val="16"/>
         </w:numPr>
         <w:spacing w:after="80" w:line="300"/>
       </w:pPr>
@@ -7988,7 +7988,7 @@
         <w:pStyle w:val="ListParagraph"/>
         <w:numPr>
           <w:ilvl w:val="0"/>
-          <w:numId w:val="3"/>
+          <w:numId w:val="16"/>
         </w:numPr>
         <w:spacing w:after="80" w:line="300"/>
       </w:pPr>
@@ -8005,7 +8005,7 @@
         <w:pStyle w:val="ListParagraph"/>
         <w:numPr>
           <w:ilvl w:val="0"/>
-          <w:numId w:val="3"/>
+          <w:numId w:val="16"/>
         </w:numPr>
         <w:spacing w:after="80" w:line="300"/>
       </w:pPr>
@@ -8022,7 +8022,7 @@
         <w:pStyle w:val="ListParagraph"/>
         <w:numPr>
           <w:ilvl w:val="0"/>
-          <w:numId w:val="3"/>
+          <w:numId w:val="16"/>
         </w:numPr>
         <w:spacing w:after="80" w:line="300"/>
       </w:pPr>
@@ -8039,7 +8039,7 @@
         <w:pStyle w:val="ListParagraph"/>
         <w:numPr>
           <w:ilvl w:val="0"/>
-          <w:numId w:val="3"/>
+          <w:numId w:val="16"/>
         </w:numPr>
         <w:spacing w:after="80" w:line="300"/>
       </w:pPr>
@@ -8266,7 +8266,7 @@
         <w:pStyle w:val="ListParagraph"/>
         <w:numPr>
           <w:ilvl w:val="0"/>
-          <w:numId w:val="3"/>
+          <w:numId w:val="17"/>
         </w:numPr>
         <w:spacing w:after="80" w:line="300"/>
       </w:pPr>
@@ -8283,7 +8283,7 @@
         <w:pStyle w:val="ListParagraph"/>
         <w:numPr>
           <w:ilvl w:val="0"/>
-          <w:numId w:val="3"/>
+          <w:numId w:val="17"/>
         </w:numPr>
         <w:spacing w:after="80" w:line="300"/>
       </w:pPr>
@@ -8300,7 +8300,7 @@
         <w:pStyle w:val="ListParagraph"/>
         <w:numPr>
           <w:ilvl w:val="0"/>
-          <w:numId w:val="3"/>
+          <w:numId w:val="17"/>
         </w:numPr>
         <w:spacing w:after="80" w:line="300"/>
       </w:pPr>
@@ -8317,7 +8317,7 @@
         <w:pStyle w:val="ListParagraph"/>
         <w:numPr>
           <w:ilvl w:val="0"/>
-          <w:numId w:val="3"/>
+          <w:numId w:val="17"/>
         </w:numPr>
         <w:spacing w:after="80" w:line="300"/>
       </w:pPr>
@@ -8334,7 +8334,7 @@
         <w:pStyle w:val="ListParagraph"/>
         <w:numPr>
           <w:ilvl w:val="0"/>
-          <w:numId w:val="3"/>
+          <w:numId w:val="17"/>
         </w:numPr>
         <w:spacing w:after="80" w:line="300"/>
       </w:pPr>
@@ -8351,7 +8351,7 @@
         <w:pStyle w:val="ListParagraph"/>
         <w:numPr>
           <w:ilvl w:val="0"/>
-          <w:numId w:val="3"/>
+          <w:numId w:val="17"/>
         </w:numPr>
         <w:spacing w:after="80" w:line="300"/>
       </w:pPr>
@@ -8368,7 +8368,7 @@
         <w:pStyle w:val="ListParagraph"/>
         <w:numPr>
           <w:ilvl w:val="0"/>
-          <w:numId w:val="3"/>
+          <w:numId w:val="17"/>
         </w:numPr>
         <w:spacing w:after="80" w:line="300"/>
       </w:pPr>
@@ -8931,7 +8931,7 @@
         <w:pStyle w:val="ListParagraph"/>
         <w:numPr>
           <w:ilvl w:val="0"/>
-          <w:numId w:val="3"/>
+          <w:numId w:val="18"/>
         </w:numPr>
         <w:spacing w:after="80" w:line="300"/>
       </w:pPr>
@@ -8948,7 +8948,7 @@
         <w:pStyle w:val="ListParagraph"/>
         <w:numPr>
           <w:ilvl w:val="0"/>
-          <w:numId w:val="3"/>
+          <w:numId w:val="18"/>
         </w:numPr>
         <w:spacing w:after="80" w:line="300"/>
       </w:pPr>
@@ -8965,7 +8965,7 @@
         <w:pStyle w:val="ListParagraph"/>
         <w:numPr>
           <w:ilvl w:val="0"/>
-          <w:numId w:val="3"/>
+          <w:numId w:val="18"/>
         </w:numPr>
         <w:spacing w:after="80" w:line="300"/>
       </w:pPr>
@@ -8982,7 +8982,7 @@
         <w:pStyle w:val="ListParagraph"/>
         <w:numPr>
           <w:ilvl w:val="0"/>
-          <w:numId w:val="3"/>
+          <w:numId w:val="18"/>
         </w:numPr>
         <w:spacing w:after="80" w:line="300"/>
       </w:pPr>
@@ -8999,7 +8999,7 @@
         <w:pStyle w:val="ListParagraph"/>
         <w:numPr>
           <w:ilvl w:val="0"/>
-          <w:numId w:val="3"/>
+          <w:numId w:val="18"/>
         </w:numPr>
         <w:spacing w:after="80" w:line="300"/>
       </w:pPr>
@@ -9016,7 +9016,7 @@
         <w:pStyle w:val="ListParagraph"/>
         <w:numPr>
           <w:ilvl w:val="0"/>
-          <w:numId w:val="3"/>
+          <w:numId w:val="18"/>
         </w:numPr>
         <w:spacing w:after="80" w:line="300"/>
       </w:pPr>
@@ -9277,7 +9277,7 @@
         <w:pStyle w:val="ListParagraph"/>
         <w:numPr>
           <w:ilvl w:val="0"/>
-          <w:numId w:val="3"/>
+          <w:numId w:val="19"/>
         </w:numPr>
         <w:spacing w:after="80" w:line="300"/>
       </w:pPr>
@@ -9294,7 +9294,7 @@
         <w:pStyle w:val="ListParagraph"/>
         <w:numPr>
           <w:ilvl w:val="0"/>
-          <w:numId w:val="3"/>
+          <w:numId w:val="19"/>
         </w:numPr>
         <w:spacing w:after="80" w:line="300"/>
       </w:pPr>
@@ -9311,7 +9311,7 @@
         <w:pStyle w:val="ListParagraph"/>
         <w:numPr>
           <w:ilvl w:val="0"/>
-          <w:numId w:val="3"/>
+          <w:numId w:val="19"/>
         </w:numPr>
         <w:spacing w:after="80" w:line="300"/>
       </w:pPr>
@@ -9328,7 +9328,7 @@
         <w:pStyle w:val="ListParagraph"/>
         <w:numPr>
           <w:ilvl w:val="0"/>
-          <w:numId w:val="3"/>
+          <w:numId w:val="19"/>
         </w:numPr>
         <w:spacing w:after="80" w:line="300"/>
       </w:pPr>
@@ -9345,7 +9345,7 @@
         <w:pStyle w:val="ListParagraph"/>
         <w:numPr>
           <w:ilvl w:val="0"/>
-          <w:numId w:val="3"/>
+          <w:numId w:val="19"/>
         </w:numPr>
         <w:spacing w:after="80" w:line="300"/>
       </w:pPr>
@@ -9716,7 +9716,7 @@
         <w:pStyle w:val="ListParagraph"/>
         <w:numPr>
           <w:ilvl w:val="0"/>
-          <w:numId w:val="3"/>
+          <w:numId w:val="20"/>
         </w:numPr>
         <w:spacing w:after="80" w:line="300"/>
       </w:pPr>
@@ -9733,7 +9733,7 @@
         <w:pStyle w:val="ListParagraph"/>
         <w:numPr>
           <w:ilvl w:val="0"/>
-          <w:numId w:val="3"/>
+          <w:numId w:val="20"/>
         </w:numPr>
         <w:spacing w:after="80" w:line="300"/>
       </w:pPr>
@@ -9750,7 +9750,7 @@
         <w:pStyle w:val="ListParagraph"/>
         <w:numPr>
           <w:ilvl w:val="0"/>
-          <w:numId w:val="3"/>
+          <w:numId w:val="20"/>
         </w:numPr>
         <w:spacing w:after="80" w:line="300"/>
       </w:pPr>
@@ -9767,7 +9767,7 @@
         <w:pStyle w:val="ListParagraph"/>
         <w:numPr>
           <w:ilvl w:val="0"/>
-          <w:numId w:val="3"/>
+          <w:numId w:val="20"/>
         </w:numPr>
         <w:spacing w:after="80" w:line="300"/>
       </w:pPr>
@@ -9784,7 +9784,7 @@
         <w:pStyle w:val="ListParagraph"/>
         <w:numPr>
           <w:ilvl w:val="0"/>
-          <w:numId w:val="3"/>
+          <w:numId w:val="20"/>
         </w:numPr>
         <w:spacing w:after="80" w:line="300"/>
       </w:pPr>
@@ -9801,7 +9801,7 @@
         <w:pStyle w:val="ListParagraph"/>
         <w:numPr>
           <w:ilvl w:val="0"/>
-          <w:numId w:val="3"/>
+          <w:numId w:val="20"/>
         </w:numPr>
         <w:spacing w:after="80" w:line="300"/>
       </w:pPr>
@@ -9818,7 +9818,7 @@
         <w:pStyle w:val="ListParagraph"/>
         <w:numPr>
           <w:ilvl w:val="0"/>
-          <w:numId w:val="3"/>
+          <w:numId w:val="20"/>
         </w:numPr>
         <w:spacing w:after="80" w:line="300"/>
       </w:pPr>
@@ -10360,7 +10360,7 @@
         <w:pStyle w:val="ListParagraph"/>
         <w:numPr>
           <w:ilvl w:val="0"/>
-          <w:numId w:val="3"/>
+          <w:numId w:val="21"/>
         </w:numPr>
         <w:spacing w:after="80" w:line="300"/>
       </w:pPr>
@@ -10377,7 +10377,7 @@
         <w:pStyle w:val="ListParagraph"/>
         <w:numPr>
           <w:ilvl w:val="0"/>
-          <w:numId w:val="3"/>
+          <w:numId w:val="21"/>
         </w:numPr>
         <w:spacing w:after="80" w:line="300"/>
       </w:pPr>
@@ -10394,7 +10394,7 @@
         <w:pStyle w:val="ListParagraph"/>
         <w:numPr>
           <w:ilvl w:val="0"/>
-          <w:numId w:val="3"/>
+          <w:numId w:val="21"/>
         </w:numPr>
         <w:spacing w:after="80" w:line="300"/>
       </w:pPr>
@@ -10411,7 +10411,7 @@
         <w:pStyle w:val="ListParagraph"/>
         <w:numPr>
           <w:ilvl w:val="0"/>
-          <w:numId w:val="3"/>
+          <w:numId w:val="21"/>
         </w:numPr>
         <w:spacing w:after="80" w:line="300"/>
       </w:pPr>
@@ -10428,7 +10428,7 @@
         <w:pStyle w:val="ListParagraph"/>
         <w:numPr>
           <w:ilvl w:val="0"/>
-          <w:numId w:val="3"/>
+          <w:numId w:val="21"/>
         </w:numPr>
         <w:spacing w:after="80" w:line="300"/>
       </w:pPr>
@@ -10445,7 +10445,7 @@
         <w:pStyle w:val="ListParagraph"/>
         <w:numPr>
           <w:ilvl w:val="0"/>
-          <w:numId w:val="3"/>
+          <w:numId w:val="21"/>
         </w:numPr>
         <w:spacing w:after="80" w:line="300"/>
       </w:pPr>
@@ -10462,7 +10462,7 @@
         <w:pStyle w:val="ListParagraph"/>
         <w:numPr>
           <w:ilvl w:val="0"/>
-          <w:numId w:val="3"/>
+          <w:numId w:val="21"/>
         </w:numPr>
         <w:spacing w:after="80" w:line="300"/>
       </w:pPr>
@@ -10919,7 +10919,7 @@
         <w:pStyle w:val="ListParagraph"/>
         <w:numPr>
           <w:ilvl w:val="0"/>
-          <w:numId w:val="3"/>
+          <w:numId w:val="22"/>
         </w:numPr>
         <w:spacing w:after="80" w:line="300"/>
       </w:pPr>
@@ -10936,7 +10936,7 @@
         <w:pStyle w:val="ListParagraph"/>
         <w:numPr>
           <w:ilvl w:val="0"/>
-          <w:numId w:val="3"/>
+          <w:numId w:val="22"/>
         </w:numPr>
         <w:spacing w:after="80" w:line="300"/>
       </w:pPr>
@@ -10953,7 +10953,7 @@
         <w:pStyle w:val="ListParagraph"/>
         <w:numPr>
           <w:ilvl w:val="0"/>
-          <w:numId w:val="3"/>
+          <w:numId w:val="22"/>
         </w:numPr>
         <w:spacing w:after="80" w:line="300"/>
       </w:pPr>
@@ -10970,7 +10970,7 @@
         <w:pStyle w:val="ListParagraph"/>
         <w:numPr>
           <w:ilvl w:val="0"/>
-          <w:numId w:val="3"/>
+          <w:numId w:val="22"/>
         </w:numPr>
         <w:spacing w:after="80" w:line="300"/>
       </w:pPr>
@@ -10987,7 +10987,7 @@
         <w:pStyle w:val="ListParagraph"/>
         <w:numPr>
           <w:ilvl w:val="0"/>
-          <w:numId w:val="3"/>
+          <w:numId w:val="22"/>
         </w:numPr>
         <w:spacing w:after="80" w:line="300"/>
       </w:pPr>
@@ -11004,7 +11004,7 @@
         <w:pStyle w:val="ListParagraph"/>
         <w:numPr>
           <w:ilvl w:val="0"/>
-          <w:numId w:val="3"/>
+          <w:numId w:val="22"/>
         </w:numPr>
         <w:spacing w:after="80" w:line="300"/>
       </w:pPr>
@@ -11021,7 +11021,7 @@
         <w:pStyle w:val="ListParagraph"/>
         <w:numPr>
           <w:ilvl w:val="0"/>
-          <w:numId w:val="3"/>
+          <w:numId w:val="22"/>
         </w:numPr>
         <w:spacing w:after="80" w:line="300"/>
       </w:pPr>
@@ -11038,7 +11038,7 @@
         <w:pStyle w:val="ListParagraph"/>
         <w:numPr>
           <w:ilvl w:val="0"/>
-          <w:numId w:val="3"/>
+          <w:numId w:val="22"/>
         </w:numPr>
         <w:spacing w:after="80" w:line="300"/>
       </w:pPr>
@@ -11467,7 +11467,7 @@
         <w:pStyle w:val="ListParagraph"/>
         <w:numPr>
           <w:ilvl w:val="0"/>
-          <w:numId w:val="3"/>
+          <w:numId w:val="23"/>
         </w:numPr>
         <w:spacing w:after="80" w:line="300"/>
       </w:pPr>
@@ -11484,7 +11484,7 @@
         <w:pStyle w:val="ListParagraph"/>
         <w:numPr>
           <w:ilvl w:val="0"/>
-          <w:numId w:val="3"/>
+          <w:numId w:val="23"/>
         </w:numPr>
         <w:spacing w:after="80" w:line="300"/>
       </w:pPr>
@@ -11501,7 +11501,7 @@
         <w:pStyle w:val="ListParagraph"/>
         <w:numPr>
           <w:ilvl w:val="0"/>
-          <w:numId w:val="3"/>
+          <w:numId w:val="23"/>
         </w:numPr>
         <w:spacing w:after="80" w:line="300"/>
       </w:pPr>
@@ -11518,7 +11518,7 @@
         <w:pStyle w:val="ListParagraph"/>
         <w:numPr>
           <w:ilvl w:val="0"/>
-          <w:numId w:val="3"/>
+          <w:numId w:val="23"/>
         </w:numPr>
         <w:spacing w:after="80" w:line="300"/>
       </w:pPr>
@@ -11535,7 +11535,7 @@
         <w:pStyle w:val="ListParagraph"/>
         <w:numPr>
           <w:ilvl w:val="0"/>
-          <w:numId w:val="3"/>
+          <w:numId w:val="23"/>
         </w:numPr>
         <w:spacing w:after="80" w:line="300"/>
       </w:pPr>
@@ -11765,7 +11765,7 @@
         <w:pStyle w:val="ListParagraph"/>
         <w:numPr>
           <w:ilvl w:val="0"/>
-          <w:numId w:val="3"/>
+          <w:numId w:val="24"/>
         </w:numPr>
         <w:spacing w:after="80" w:line="300"/>
       </w:pPr>
@@ -11782,7 +11782,7 @@
         <w:pStyle w:val="ListParagraph"/>
         <w:numPr>
           <w:ilvl w:val="0"/>
-          <w:numId w:val="3"/>
+          <w:numId w:val="24"/>
         </w:numPr>
         <w:spacing w:after="80" w:line="300"/>
       </w:pPr>
@@ -11799,7 +11799,7 @@
         <w:pStyle w:val="ListParagraph"/>
         <w:numPr>
           <w:ilvl w:val="0"/>
-          <w:numId w:val="3"/>
+          <w:numId w:val="24"/>
         </w:numPr>
         <w:spacing w:after="80" w:line="300"/>
       </w:pPr>
@@ -11816,7 +11816,7 @@
         <w:pStyle w:val="ListParagraph"/>
         <w:numPr>
           <w:ilvl w:val="0"/>
-          <w:numId w:val="3"/>
+          <w:numId w:val="24"/>
         </w:numPr>
         <w:spacing w:after="80" w:line="300"/>
       </w:pPr>
@@ -11833,7 +11833,7 @@
         <w:pStyle w:val="ListParagraph"/>
         <w:numPr>
           <w:ilvl w:val="0"/>
-          <w:numId w:val="3"/>
+          <w:numId w:val="24"/>
         </w:numPr>
         <w:spacing w:after="80" w:line="300"/>
       </w:pPr>
@@ -11903,7 +11903,7 @@
         <w:pStyle w:val="ListParagraph"/>
         <w:numPr>
           <w:ilvl w:val="0"/>
-          <w:numId w:val="3"/>
+          <w:numId w:val="25"/>
         </w:numPr>
         <w:spacing w:after="80" w:line="300"/>
       </w:pPr>
@@ -11920,7 +11920,7 @@
         <w:pStyle w:val="ListParagraph"/>
         <w:numPr>
           <w:ilvl w:val="0"/>
-          <w:numId w:val="3"/>
+          <w:numId w:val="25"/>
         </w:numPr>
         <w:spacing w:after="80" w:line="300"/>
       </w:pPr>
@@ -11937,7 +11937,7 @@
         <w:pStyle w:val="ListParagraph"/>
         <w:numPr>
           <w:ilvl w:val="0"/>
-          <w:numId w:val="3"/>
+          <w:numId w:val="25"/>
         </w:numPr>
         <w:spacing w:after="80" w:line="300"/>
       </w:pPr>
@@ -13020,7 +13020,7 @@
         <w:pStyle w:val="ListParagraph"/>
         <w:numPr>
           <w:ilvl w:val="0"/>
-          <w:numId w:val="3"/>
+          <w:numId w:val="26"/>
         </w:numPr>
         <w:spacing w:after="80" w:line="300"/>
       </w:pPr>
@@ -13037,7 +13037,7 @@
         <w:pStyle w:val="ListParagraph"/>
         <w:numPr>
           <w:ilvl w:val="0"/>
-          <w:numId w:val="3"/>
+          <w:numId w:val="26"/>
         </w:numPr>
         <w:spacing w:after="80" w:line="300"/>
       </w:pPr>
@@ -13054,7 +13054,7 @@
         <w:pStyle w:val="ListParagraph"/>
         <w:numPr>
           <w:ilvl w:val="0"/>
-          <w:numId w:val="3"/>
+          <w:numId w:val="26"/>
         </w:numPr>
         <w:spacing w:after="80" w:line="300"/>
       </w:pPr>
@@ -13071,7 +13071,7 @@
         <w:pStyle w:val="ListParagraph"/>
         <w:numPr>
           <w:ilvl w:val="0"/>
-          <w:numId w:val="3"/>
+          <w:numId w:val="26"/>
         </w:numPr>
         <w:spacing w:after="80" w:line="300"/>
       </w:pPr>
@@ -14270,7 +14270,7 @@
         <w:pStyle w:val="ListParagraph"/>
         <w:numPr>
           <w:ilvl w:val="0"/>
-          <w:numId w:val="3"/>
+          <w:numId w:val="27"/>
         </w:numPr>
         <w:spacing w:after="80" w:line="300"/>
       </w:pPr>
@@ -14287,7 +14287,7 @@
         <w:pStyle w:val="ListParagraph"/>
         <w:numPr>
           <w:ilvl w:val="0"/>
-          <w:numId w:val="3"/>
+          <w:numId w:val="27"/>
         </w:numPr>
         <w:spacing w:after="80" w:line="300"/>
       </w:pPr>
@@ -14304,7 +14304,7 @@
         <w:pStyle w:val="ListParagraph"/>
         <w:numPr>
           <w:ilvl w:val="0"/>
-          <w:numId w:val="3"/>
+          <w:numId w:val="27"/>
         </w:numPr>
         <w:spacing w:after="80" w:line="300"/>
       </w:pPr>
@@ -14321,7 +14321,7 @@
         <w:pStyle w:val="ListParagraph"/>
         <w:numPr>
           <w:ilvl w:val="0"/>
-          <w:numId w:val="3"/>
+          <w:numId w:val="27"/>
         </w:numPr>
         <w:spacing w:after="80" w:line="300"/>
       </w:pPr>
@@ -14338,7 +14338,7 @@
         <w:pStyle w:val="ListParagraph"/>
         <w:numPr>
           <w:ilvl w:val="0"/>
-          <w:numId w:val="3"/>
+          <w:numId w:val="27"/>
         </w:numPr>
         <w:spacing w:after="80" w:line="300"/>
       </w:pPr>
@@ -15691,6 +15691,150 @@
     </w:lvlOverride>
   </w:num>
   <w:num w:numId="3">
+    <w:abstractNumId w:val="3"/>
+    <w:lvlOverride w:ilvl="0">
+      <w:startOverride w:val="1"/>
+    </w:lvlOverride>
+  </w:num>
+  <w:num w:numId="4">
+    <w:abstractNumId w:val="3"/>
+    <w:lvlOverride w:ilvl="0">
+      <w:startOverride w:val="1"/>
+    </w:lvlOverride>
+  </w:num>
+  <w:num w:numId="5">
+    <w:abstractNumId w:val="3"/>
+    <w:lvlOverride w:ilvl="0">
+      <w:startOverride w:val="1"/>
+    </w:lvlOverride>
+  </w:num>
+  <w:num w:numId="6">
+    <w:abstractNumId w:val="3"/>
+    <w:lvlOverride w:ilvl="0">
+      <w:startOverride w:val="1"/>
+    </w:lvlOverride>
+  </w:num>
+  <w:num w:numId="7">
+    <w:abstractNumId w:val="3"/>
+    <w:lvlOverride w:ilvl="0">
+      <w:startOverride w:val="1"/>
+    </w:lvlOverride>
+  </w:num>
+  <w:num w:numId="8">
+    <w:abstractNumId w:val="3"/>
+    <w:lvlOverride w:ilvl="0">
+      <w:startOverride w:val="1"/>
+    </w:lvlOverride>
+  </w:num>
+  <w:num w:numId="9">
+    <w:abstractNumId w:val="3"/>
+    <w:lvlOverride w:ilvl="0">
+      <w:startOverride w:val="1"/>
+    </w:lvlOverride>
+  </w:num>
+  <w:num w:numId="10">
+    <w:abstractNumId w:val="3"/>
+    <w:lvlOverride w:ilvl="0">
+      <w:startOverride w:val="1"/>
+    </w:lvlOverride>
+  </w:num>
+  <w:num w:numId="11">
+    <w:abstractNumId w:val="3"/>
+    <w:lvlOverride w:ilvl="0">
+      <w:startOverride w:val="1"/>
+    </w:lvlOverride>
+  </w:num>
+  <w:num w:numId="12">
+    <w:abstractNumId w:val="3"/>
+    <w:lvlOverride w:ilvl="0">
+      <w:startOverride w:val="1"/>
+    </w:lvlOverride>
+  </w:num>
+  <w:num w:numId="13">
+    <w:abstractNumId w:val="3"/>
+    <w:lvlOverride w:ilvl="0">
+      <w:startOverride w:val="1"/>
+    </w:lvlOverride>
+  </w:num>
+  <w:num w:numId="14">
+    <w:abstractNumId w:val="3"/>
+    <w:lvlOverride w:ilvl="0">
+      <w:startOverride w:val="1"/>
+    </w:lvlOverride>
+  </w:num>
+  <w:num w:numId="15">
+    <w:abstractNumId w:val="3"/>
+    <w:lvlOverride w:ilvl="0">
+      <w:startOverride w:val="1"/>
+    </w:lvlOverride>
+  </w:num>
+  <w:num w:numId="16">
+    <w:abstractNumId w:val="3"/>
+    <w:lvlOverride w:ilvl="0">
+      <w:startOverride w:val="1"/>
+    </w:lvlOverride>
+  </w:num>
+  <w:num w:numId="17">
+    <w:abstractNumId w:val="3"/>
+    <w:lvlOverride w:ilvl="0">
+      <w:startOverride w:val="1"/>
+    </w:lvlOverride>
+  </w:num>
+  <w:num w:numId="18">
+    <w:abstractNumId w:val="3"/>
+    <w:lvlOverride w:ilvl="0">
+      <w:startOverride w:val="1"/>
+    </w:lvlOverride>
+  </w:num>
+  <w:num w:numId="19">
+    <w:abstractNumId w:val="3"/>
+    <w:lvlOverride w:ilvl="0">
+      <w:startOverride w:val="1"/>
+    </w:lvlOverride>
+  </w:num>
+  <w:num w:numId="20">
+    <w:abstractNumId w:val="3"/>
+    <w:lvlOverride w:ilvl="0">
+      <w:startOverride w:val="1"/>
+    </w:lvlOverride>
+  </w:num>
+  <w:num w:numId="21">
+    <w:abstractNumId w:val="3"/>
+    <w:lvlOverride w:ilvl="0">
+      <w:startOverride w:val="1"/>
+    </w:lvlOverride>
+  </w:num>
+  <w:num w:numId="22">
+    <w:abstractNumId w:val="3"/>
+    <w:lvlOverride w:ilvl="0">
+      <w:startOverride w:val="1"/>
+    </w:lvlOverride>
+  </w:num>
+  <w:num w:numId="23">
+    <w:abstractNumId w:val="3"/>
+    <w:lvlOverride w:ilvl="0">
+      <w:startOverride w:val="1"/>
+    </w:lvlOverride>
+  </w:num>
+  <w:num w:numId="24">
+    <w:abstractNumId w:val="3"/>
+    <w:lvlOverride w:ilvl="0">
+      <w:startOverride w:val="1"/>
+    </w:lvlOverride>
+  </w:num>
+  <w:num w:numId="25">
+    <w:abstractNumId w:val="3"/>
+    <w:lvlOverride w:ilvl="0">
+      <w:startOverride w:val="1"/>
+    </w:lvlOverride>
+  </w:num>
+  <w:num w:numId="26">
+    <w:abstractNumId w:val="3"/>
+    <w:lvlOverride w:ilvl="0">
+      <w:startOverride w:val="1"/>
+    </w:lvlOverride>
+  </w:num>
+  <w:num w:numId="27">
     <w:abstractNumId w:val="3"/>
     <w:lvlOverride w:ilvl="0">
       <w:startOverride w:val="1"/>

</xml_diff>